<commit_message>
nmv 03 07 2026
</commit_message>
<xml_diff>
--- a/TS-Kramam/TS-3.2/TS 3.2 Malayalam Krama Paatam Corrections.docx
+++ b/TS-Kramam/TS-3.2/TS 3.2 Malayalam Krama Paatam Corrections.docx
@@ -61,18 +61,7 @@
           <w:szCs w:val="32"/>
           <w:u w:val="single"/>
         </w:rPr>
-        <w:t xml:space="preserve"> Corrections –Observed </w:t>
-      </w:r>
-      <w:proofErr w:type="gramStart"/>
-      <w:r>
-        <w:rPr>
-          <w:b/>
-          <w:bCs/>
-          <w:sz w:val="32"/>
-          <w:szCs w:val="32"/>
-          <w:u w:val="single"/>
-        </w:rPr>
-        <w:t xml:space="preserve">till </w:t>
+        <w:t xml:space="preserve"> Corrections –Observed till </w:t>
       </w:r>
       <w:r>
         <w:rPr>
@@ -85,7 +74,6 @@
         </w:rPr>
         <w:t>?????</w:t>
       </w:r>
-      <w:proofErr w:type="gramEnd"/>
     </w:p>
     <w:p>
       <w:pPr>
@@ -119,7 +107,8 @@
         <w:tblLook w:val="04A0" w:firstRow="1" w:lastRow="0" w:firstColumn="1" w:lastColumn="0" w:noHBand="0" w:noVBand="1"/>
       </w:tblPr>
       <w:tblGrid>
-        <w:gridCol w:w="3906"/>
+        <w:gridCol w:w="78"/>
+        <w:gridCol w:w="3828"/>
         <w:gridCol w:w="5103"/>
         <w:gridCol w:w="5386"/>
       </w:tblGrid>
@@ -127,6 +116,7 @@
         <w:tc>
           <w:tcPr>
             <w:tcW w:w="3906" w:type="dxa"/>
+            <w:gridSpan w:val="2"/>
           </w:tcPr>
           <w:p>
             <w:pPr>
@@ -205,6 +195,1193 @@
                 <w:szCs w:val="32"/>
               </w:rPr>
               <w:t>To be read as or corrected as</w:t>
+            </w:r>
+          </w:p>
+        </w:tc>
+      </w:tr>
+      <w:tr>
+        <w:trPr>
+          <w:gridBefore w:val="1"/>
+          <w:wBefore w:w="78" w:type="dxa"/>
+          <w:trHeight w:val="1489"/>
+        </w:trPr>
+        <w:tc>
+          <w:tcPr>
+            <w:tcW w:w="3828" w:type="dxa"/>
+          </w:tcPr>
+          <w:p>
+            <w:pPr>
+              <w:widowControl w:val="0"/>
+              <w:tabs>
+                <w:tab w:val="left" w:pos="993"/>
+              </w:tabs>
+              <w:autoSpaceDE w:val="0"/>
+              <w:autoSpaceDN w:val="0"/>
+              <w:adjustRightInd w:val="0"/>
+              <w:spacing w:before="0" w:line="240" w:lineRule="auto"/>
+              <w:ind w:right="297"/>
+              <w:rPr>
+                <w:rFonts w:cs="Arial"/>
+                <w:b/>
+                <w:color w:val="000000"/>
+                <w:sz w:val="28"/>
+                <w:szCs w:val="32"/>
+                <w:lang w:val="en-IN"/>
+              </w:rPr>
+            </w:pPr>
+            <w:r>
+              <w:rPr>
+                <w:rFonts w:eastAsia="Times New Roman" w:cs="Arial"/>
+                <w:b/>
+                <w:bCs/>
+                <w:sz w:val="28"/>
+                <w:szCs w:val="28"/>
+                <w:lang w:val="en-IN" w:eastAsia="en-IN" w:bidi="ml-IN"/>
+              </w:rPr>
+              <w:t xml:space="preserve">TS 3.2.2.1 - </w:t>
+            </w:r>
+            <w:r>
+              <w:rPr>
+                <w:rFonts w:cs="Arial"/>
+                <w:b/>
+                <w:color w:val="000000"/>
+                <w:sz w:val="28"/>
+                <w:szCs w:val="32"/>
+                <w:lang w:val="en-IN"/>
+              </w:rPr>
+              <w:t>Kramam</w:t>
+            </w:r>
+          </w:p>
+          <w:p>
+            <w:pPr>
+              <w:widowControl w:val="0"/>
+              <w:autoSpaceDE w:val="0"/>
+              <w:autoSpaceDN w:val="0"/>
+              <w:adjustRightInd w:val="0"/>
+              <w:spacing w:before="0" w:line="240" w:lineRule="auto"/>
+              <w:ind w:right="-320"/>
+              <w:jc w:val="both"/>
+              <w:rPr>
+                <w:rFonts w:eastAsia="Times New Roman" w:cs="Arial"/>
+                <w:b/>
+                <w:bCs/>
+                <w:sz w:val="28"/>
+                <w:szCs w:val="28"/>
+                <w:lang w:val="en-IN" w:eastAsia="en-IN" w:bidi="ml-IN"/>
+              </w:rPr>
+            </w:pPr>
+            <w:r>
+              <w:rPr>
+                <w:rFonts w:cs="Arial"/>
+                <w:b/>
+                <w:color w:val="000000"/>
+                <w:sz w:val="28"/>
+                <w:szCs w:val="32"/>
+                <w:lang w:val="en-IN"/>
+              </w:rPr>
+              <w:t>Krama Vaakyam No</w:t>
+            </w:r>
+            <w:r>
+              <w:rPr>
+                <w:rFonts w:eastAsia="Times New Roman" w:cs="Arial"/>
+                <w:b/>
+                <w:bCs/>
+                <w:sz w:val="28"/>
+                <w:szCs w:val="28"/>
+                <w:lang w:val="en-IN" w:eastAsia="en-IN" w:bidi="ml-IN"/>
+              </w:rPr>
+              <w:t>. 44</w:t>
+            </w:r>
+          </w:p>
+          <w:p>
+            <w:pPr>
+              <w:spacing w:before="0" w:line="240" w:lineRule="auto"/>
+              <w:rPr>
+                <w:rFonts w:cs="Arial"/>
+                <w:bCs/>
+                <w:sz w:val="28"/>
+                <w:szCs w:val="28"/>
+                <w:lang w:val="it-IT"/>
+              </w:rPr>
+            </w:pPr>
+            <w:r>
+              <w:rPr>
+                <w:rFonts w:eastAsia="Times New Roman" w:cs="Arial"/>
+                <w:b/>
+                <w:bCs/>
+                <w:sz w:val="28"/>
+                <w:szCs w:val="28"/>
+                <w:lang w:val="it-IT" w:eastAsia="en-IN" w:bidi="ml-IN"/>
+              </w:rPr>
+              <w:t>Panchaati No. 4</w:t>
+            </w:r>
+          </w:p>
+        </w:tc>
+        <w:tc>
+          <w:tcPr>
+            <w:tcW w:w="5103" w:type="dxa"/>
+          </w:tcPr>
+          <w:p>
+            <w:pPr>
+              <w:spacing w:before="0" w:line="240" w:lineRule="auto"/>
+              <w:rPr>
+                <w:rFonts w:ascii="BRH Malayalam Extra" w:hAnsi="BRH Malayalam Extra" w:cs="BRH Malayalam Extra"/>
+                <w:color w:val="000000"/>
+                <w:sz w:val="40"/>
+                <w:szCs w:val="40"/>
+                <w:lang w:val="it-IT"/>
+              </w:rPr>
+            </w:pPr>
+            <w:r>
+              <w:rPr>
+                <w:rFonts w:ascii="BRH Malayalam Extra" w:hAnsi="BRH Malayalam Extra" w:cs="BRH Malayalam Extra"/>
+                <w:color w:val="000000"/>
+                <w:sz w:val="40"/>
+                <w:szCs w:val="40"/>
+                <w:lang w:val="it-IT"/>
+              </w:rPr>
+              <w:t>q¡</w:t>
+            </w:r>
+            <w:r>
+              <w:rPr>
+                <w:rFonts w:ascii="BRH Malayalam Extra" w:hAnsi="BRH Malayalam Extra" w:cs="BRH Malayalam Extra"/>
+                <w:b/>
+                <w:color w:val="000000"/>
+                <w:sz w:val="33"/>
+                <w:szCs w:val="40"/>
+                <w:lang w:val="it-IT"/>
+              </w:rPr>
+              <w:t>–</w:t>
+            </w:r>
+            <w:r>
+              <w:rPr>
+                <w:rFonts w:ascii="BRH Malayalam Extra" w:hAnsi="BRH Malayalam Extra" w:cs="BRH Malayalam Extra"/>
+                <w:color w:val="000000"/>
+                <w:sz w:val="40"/>
+                <w:szCs w:val="40"/>
+                <w:lang w:val="it-IT"/>
+              </w:rPr>
+              <w:t>öKp—Çy s</w:t>
+            </w:r>
+            <w:r>
+              <w:rPr>
+                <w:rFonts w:ascii="BRH Malayalam Extra" w:hAnsi="BRH Malayalam Extra" w:cs="BRH Malayalam Extra"/>
+                <w:b/>
+                <w:color w:val="000000"/>
+                <w:sz w:val="33"/>
+                <w:szCs w:val="40"/>
+                <w:lang w:val="it-IT"/>
+              </w:rPr>
+              <w:t>–</w:t>
+            </w:r>
+            <w:r>
+              <w:rPr>
+                <w:rFonts w:ascii="BRH Malayalam Extra" w:hAnsi="BRH Malayalam Extra" w:cs="BRH Malayalam Extra"/>
+                <w:color w:val="000000"/>
+                <w:sz w:val="40"/>
+                <w:szCs w:val="40"/>
+                <w:lang w:val="it-IT"/>
+              </w:rPr>
+              <w:t xml:space="preserve">ixp—bûzkõxYy | </w:t>
+            </w:r>
+          </w:p>
+          <w:p>
+            <w:pPr>
+              <w:spacing w:before="0" w:line="240" w:lineRule="auto"/>
+              <w:rPr>
+                <w:rFonts w:ascii="BRH Malayalam Extra" w:hAnsi="BRH Malayalam Extra" w:cs="BRH Malayalam Extra"/>
+                <w:sz w:val="40"/>
+                <w:szCs w:val="40"/>
+                <w:lang w:val="it-IT"/>
+              </w:rPr>
+            </w:pPr>
+            <w:r>
+              <w:rPr>
+                <w:rFonts w:ascii="BRH Malayalam Extra" w:hAnsi="BRH Malayalam Extra" w:cs="BRH Malayalam Extra"/>
+                <w:color w:val="000000"/>
+                <w:sz w:val="40"/>
+                <w:szCs w:val="40"/>
+                <w:lang w:val="it-IT"/>
+              </w:rPr>
+              <w:t>q¡</w:t>
+            </w:r>
+            <w:r>
+              <w:rPr>
+                <w:rFonts w:ascii="BRH Malayalam Extra" w:hAnsi="BRH Malayalam Extra" w:cs="BRH Malayalam Extra"/>
+                <w:b/>
+                <w:color w:val="000000"/>
+                <w:sz w:val="33"/>
+                <w:szCs w:val="40"/>
+                <w:lang w:val="it-IT"/>
+              </w:rPr>
+              <w:t>–</w:t>
+            </w:r>
+            <w:r>
+              <w:rPr>
+                <w:rFonts w:ascii="BRH Malayalam Extra" w:hAnsi="BRH Malayalam Extra" w:cs="BRH Malayalam Extra"/>
+                <w:color w:val="000000"/>
+                <w:sz w:val="40"/>
+                <w:szCs w:val="40"/>
+                <w:highlight w:val="yellow"/>
+                <w:lang w:val="it-IT"/>
+              </w:rPr>
+              <w:t>K</w:t>
+            </w:r>
+            <w:r>
+              <w:rPr>
+                <w:rFonts w:ascii="BRH Malayalam Extra" w:hAnsi="BRH Malayalam Extra" w:cs="BRH Malayalam Extra"/>
+                <w:color w:val="000000"/>
+                <w:sz w:val="40"/>
+                <w:szCs w:val="40"/>
+                <w:lang w:val="it-IT"/>
+              </w:rPr>
+              <w:t>p</w:t>
+            </w:r>
+            <w:r>
+              <w:rPr>
+                <w:rFonts w:ascii="BRH Malayalam Extra" w:hAnsi="BRH Malayalam Extra" w:cs="BRH Malayalam Extra"/>
+                <w:b/>
+                <w:color w:val="000000"/>
+                <w:sz w:val="33"/>
+                <w:szCs w:val="40"/>
+                <w:lang w:val="it-IT"/>
+              </w:rPr>
+              <w:t>–</w:t>
+            </w:r>
+            <w:r>
+              <w:rPr>
+                <w:rFonts w:ascii="BRH Malayalam Extra" w:hAnsi="BRH Malayalam Extra" w:cs="BRH Malayalam Extra"/>
+                <w:color w:val="000000"/>
+                <w:sz w:val="40"/>
+                <w:szCs w:val="40"/>
+                <w:lang w:val="it-IT"/>
+              </w:rPr>
+              <w:t>ÇzZy— q¡</w:t>
+            </w:r>
+            <w:r>
+              <w:rPr>
+                <w:rFonts w:ascii="BRH Malayalam Extra" w:hAnsi="BRH Malayalam Extra" w:cs="BRH Malayalam Extra"/>
+                <w:b/>
+                <w:color w:val="000000"/>
+                <w:sz w:val="33"/>
+                <w:szCs w:val="40"/>
+                <w:lang w:val="it-IT"/>
+              </w:rPr>
+              <w:t>–</w:t>
+            </w:r>
+            <w:r>
+              <w:rPr>
+                <w:rFonts w:ascii="BRH Malayalam Extra" w:hAnsi="BRH Malayalam Extra" w:cs="BRH Malayalam Extra"/>
+                <w:color w:val="000000"/>
+                <w:sz w:val="40"/>
+                <w:szCs w:val="40"/>
+                <w:lang w:val="it-IT"/>
+              </w:rPr>
+              <w:t>öK - p</w:t>
+            </w:r>
+            <w:r>
+              <w:rPr>
+                <w:rFonts w:ascii="BRH Malayalam Extra" w:hAnsi="BRH Malayalam Extra" w:cs="BRH Malayalam Extra"/>
+                <w:b/>
+                <w:color w:val="000000"/>
+                <w:sz w:val="33"/>
+                <w:szCs w:val="40"/>
+                <w:lang w:val="it-IT"/>
+              </w:rPr>
+              <w:t>–</w:t>
+            </w:r>
+            <w:r>
+              <w:rPr>
+                <w:rFonts w:ascii="BRH Malayalam Extra" w:hAnsi="BRH Malayalam Extra" w:cs="BRH Malayalam Extra"/>
+                <w:color w:val="000000"/>
+                <w:sz w:val="40"/>
+                <w:szCs w:val="40"/>
+                <w:lang w:val="it-IT"/>
+              </w:rPr>
+              <w:t>Çy</w:t>
+            </w:r>
+            <w:r>
+              <w:rPr>
+                <w:rFonts w:ascii="BRH Malayalam Extra" w:hAnsi="BRH Malayalam Extra" w:cs="BRH Malayalam Extra"/>
+                <w:b/>
+                <w:color w:val="000000"/>
+                <w:sz w:val="33"/>
+                <w:szCs w:val="40"/>
+                <w:lang w:val="it-IT"/>
+              </w:rPr>
+              <w:t>–</w:t>
+            </w:r>
+            <w:r>
+              <w:rPr>
+                <w:rFonts w:ascii="BRH Malayalam Extra" w:hAnsi="BRH Malayalam Extra" w:cs="BRH Malayalam Extra"/>
+                <w:color w:val="000000"/>
+                <w:sz w:val="40"/>
+                <w:szCs w:val="40"/>
+                <w:lang w:val="it-IT"/>
+              </w:rPr>
+              <w:t xml:space="preserve"> |</w:t>
+            </w:r>
+          </w:p>
+        </w:tc>
+        <w:tc>
+          <w:tcPr>
+            <w:tcW w:w="5386" w:type="dxa"/>
+          </w:tcPr>
+          <w:p>
+            <w:pPr>
+              <w:widowControl w:val="0"/>
+              <w:autoSpaceDE w:val="0"/>
+              <w:autoSpaceDN w:val="0"/>
+              <w:adjustRightInd w:val="0"/>
+              <w:spacing w:before="0" w:line="240" w:lineRule="auto"/>
+              <w:rPr>
+                <w:rFonts w:ascii="BRH Malayalam Extra" w:hAnsi="BRH Malayalam Extra" w:cs="BRH Malayalam Extra"/>
+                <w:color w:val="000000"/>
+                <w:sz w:val="40"/>
+                <w:szCs w:val="40"/>
+                <w:lang w:val="it-IT"/>
+              </w:rPr>
+            </w:pPr>
+            <w:r>
+              <w:rPr>
+                <w:rFonts w:ascii="BRH Malayalam Extra" w:hAnsi="BRH Malayalam Extra" w:cs="BRH Malayalam Extra"/>
+                <w:color w:val="000000"/>
+                <w:sz w:val="40"/>
+                <w:szCs w:val="40"/>
+                <w:lang w:val="it-IT"/>
+              </w:rPr>
+              <w:t>q¡</w:t>
+            </w:r>
+            <w:r>
+              <w:rPr>
+                <w:rFonts w:ascii="BRH Malayalam Extra" w:hAnsi="BRH Malayalam Extra" w:cs="BRH Malayalam Extra"/>
+                <w:b/>
+                <w:color w:val="000000"/>
+                <w:sz w:val="33"/>
+                <w:szCs w:val="40"/>
+                <w:lang w:val="it-IT"/>
+              </w:rPr>
+              <w:t>–</w:t>
+            </w:r>
+            <w:r>
+              <w:rPr>
+                <w:rFonts w:ascii="BRH Malayalam Extra" w:hAnsi="BRH Malayalam Extra" w:cs="BRH Malayalam Extra"/>
+                <w:color w:val="000000"/>
+                <w:sz w:val="40"/>
+                <w:szCs w:val="40"/>
+                <w:lang w:val="it-IT"/>
+              </w:rPr>
+              <w:t>öKp—Çy s</w:t>
+            </w:r>
+            <w:r>
+              <w:rPr>
+                <w:rFonts w:ascii="BRH Malayalam Extra" w:hAnsi="BRH Malayalam Extra" w:cs="BRH Malayalam Extra"/>
+                <w:b/>
+                <w:color w:val="000000"/>
+                <w:sz w:val="33"/>
+                <w:szCs w:val="40"/>
+                <w:lang w:val="it-IT"/>
+              </w:rPr>
+              <w:t>–</w:t>
+            </w:r>
+            <w:r>
+              <w:rPr>
+                <w:rFonts w:ascii="BRH Malayalam Extra" w:hAnsi="BRH Malayalam Extra" w:cs="BRH Malayalam Extra"/>
+                <w:color w:val="000000"/>
+                <w:sz w:val="40"/>
+                <w:szCs w:val="40"/>
+                <w:lang w:val="it-IT"/>
+              </w:rPr>
+              <w:t xml:space="preserve">ixp—bûzkõxYy | </w:t>
+            </w:r>
+          </w:p>
+          <w:p>
+            <w:pPr>
+              <w:widowControl w:val="0"/>
+              <w:autoSpaceDE w:val="0"/>
+              <w:autoSpaceDN w:val="0"/>
+              <w:adjustRightInd w:val="0"/>
+              <w:spacing w:before="0" w:line="240" w:lineRule="auto"/>
+              <w:rPr>
+                <w:rFonts w:ascii="BRH Malayalam Extra" w:hAnsi="BRH Malayalam Extra" w:cs="BRH Malayalam Extra"/>
+                <w:sz w:val="40"/>
+                <w:szCs w:val="40"/>
+                <w:lang w:val="it-IT"/>
+              </w:rPr>
+            </w:pPr>
+            <w:r>
+              <w:rPr>
+                <w:rFonts w:ascii="BRH Malayalam Extra" w:hAnsi="BRH Malayalam Extra" w:cs="BRH Malayalam Extra"/>
+                <w:color w:val="000000"/>
+                <w:sz w:val="40"/>
+                <w:szCs w:val="40"/>
+                <w:lang w:val="it-IT"/>
+              </w:rPr>
+              <w:t>q¡</w:t>
+            </w:r>
+            <w:r>
+              <w:rPr>
+                <w:rFonts w:ascii="BRH Malayalam Extra" w:hAnsi="BRH Malayalam Extra" w:cs="BRH Malayalam Extra"/>
+                <w:b/>
+                <w:color w:val="000000"/>
+                <w:sz w:val="33"/>
+                <w:szCs w:val="40"/>
+                <w:lang w:val="it-IT"/>
+              </w:rPr>
+              <w:t>–</w:t>
+            </w:r>
+            <w:r>
+              <w:rPr>
+                <w:rFonts w:ascii="BRH Malayalam Extra" w:hAnsi="BRH Malayalam Extra" w:cs="BRH Malayalam Extra"/>
+                <w:color w:val="000000"/>
+                <w:sz w:val="40"/>
+                <w:szCs w:val="40"/>
+                <w:highlight w:val="green"/>
+                <w:lang w:val="it-IT"/>
+              </w:rPr>
+              <w:t>ö</w:t>
+            </w:r>
+            <w:r>
+              <w:rPr>
+                <w:rFonts w:ascii="BRH Malayalam Extra" w:hAnsi="BRH Malayalam Extra" w:cs="BRH Malayalam Extra"/>
+                <w:color w:val="000000"/>
+                <w:sz w:val="40"/>
+                <w:szCs w:val="40"/>
+                <w:lang w:val="it-IT"/>
+              </w:rPr>
+              <w:t>Kp</w:t>
+            </w:r>
+            <w:r>
+              <w:rPr>
+                <w:rFonts w:ascii="BRH Malayalam Extra" w:hAnsi="BRH Malayalam Extra" w:cs="BRH Malayalam Extra"/>
+                <w:b/>
+                <w:color w:val="000000"/>
+                <w:sz w:val="33"/>
+                <w:szCs w:val="40"/>
+                <w:lang w:val="it-IT"/>
+              </w:rPr>
+              <w:t>–</w:t>
+            </w:r>
+            <w:r>
+              <w:rPr>
+                <w:rFonts w:ascii="BRH Malayalam Extra" w:hAnsi="BRH Malayalam Extra" w:cs="BRH Malayalam Extra"/>
+                <w:color w:val="000000"/>
+                <w:sz w:val="40"/>
+                <w:szCs w:val="40"/>
+                <w:lang w:val="it-IT"/>
+              </w:rPr>
+              <w:t>ÇzZy— q¡</w:t>
+            </w:r>
+            <w:r>
+              <w:rPr>
+                <w:rFonts w:ascii="BRH Malayalam Extra" w:hAnsi="BRH Malayalam Extra" w:cs="BRH Malayalam Extra"/>
+                <w:b/>
+                <w:color w:val="000000"/>
+                <w:sz w:val="33"/>
+                <w:szCs w:val="40"/>
+                <w:lang w:val="it-IT"/>
+              </w:rPr>
+              <w:t>–</w:t>
+            </w:r>
+            <w:r>
+              <w:rPr>
+                <w:rFonts w:ascii="BRH Malayalam Extra" w:hAnsi="BRH Malayalam Extra" w:cs="BRH Malayalam Extra"/>
+                <w:color w:val="000000"/>
+                <w:sz w:val="40"/>
+                <w:szCs w:val="40"/>
+                <w:lang w:val="it-IT"/>
+              </w:rPr>
+              <w:t>öK - p</w:t>
+            </w:r>
+            <w:r>
+              <w:rPr>
+                <w:rFonts w:ascii="BRH Malayalam Extra" w:hAnsi="BRH Malayalam Extra" w:cs="BRH Malayalam Extra"/>
+                <w:b/>
+                <w:color w:val="000000"/>
+                <w:sz w:val="33"/>
+                <w:szCs w:val="40"/>
+                <w:lang w:val="it-IT"/>
+              </w:rPr>
+              <w:t>–</w:t>
+            </w:r>
+            <w:r>
+              <w:rPr>
+                <w:rFonts w:ascii="BRH Malayalam Extra" w:hAnsi="BRH Malayalam Extra" w:cs="BRH Malayalam Extra"/>
+                <w:color w:val="000000"/>
+                <w:sz w:val="40"/>
+                <w:szCs w:val="40"/>
+                <w:lang w:val="it-IT"/>
+              </w:rPr>
+              <w:t>Çy</w:t>
+            </w:r>
+            <w:r>
+              <w:rPr>
+                <w:rFonts w:ascii="BRH Malayalam Extra" w:hAnsi="BRH Malayalam Extra" w:cs="BRH Malayalam Extra"/>
+                <w:b/>
+                <w:color w:val="000000"/>
+                <w:sz w:val="33"/>
+                <w:szCs w:val="40"/>
+                <w:lang w:val="it-IT"/>
+              </w:rPr>
+              <w:t>–</w:t>
+            </w:r>
+            <w:r>
+              <w:rPr>
+                <w:rFonts w:ascii="BRH Malayalam Extra" w:hAnsi="BRH Malayalam Extra" w:cs="BRH Malayalam Extra"/>
+                <w:color w:val="000000"/>
+                <w:sz w:val="40"/>
+                <w:szCs w:val="40"/>
+                <w:lang w:val="it-IT"/>
+              </w:rPr>
+              <w:t xml:space="preserve"> |</w:t>
+            </w:r>
+          </w:p>
+        </w:tc>
+      </w:tr>
+      <w:tr>
+        <w:trPr>
+          <w:gridBefore w:val="1"/>
+          <w:wBefore w:w="78" w:type="dxa"/>
+          <w:trHeight w:val="2262"/>
+        </w:trPr>
+        <w:tc>
+          <w:tcPr>
+            <w:tcW w:w="3828" w:type="dxa"/>
+          </w:tcPr>
+          <w:p>
+            <w:pPr>
+              <w:widowControl w:val="0"/>
+              <w:tabs>
+                <w:tab w:val="left" w:pos="993"/>
+              </w:tabs>
+              <w:autoSpaceDE w:val="0"/>
+              <w:autoSpaceDN w:val="0"/>
+              <w:adjustRightInd w:val="0"/>
+              <w:spacing w:before="0" w:line="240" w:lineRule="auto"/>
+              <w:ind w:right="297"/>
+              <w:rPr>
+                <w:rFonts w:cs="Arial"/>
+                <w:b/>
+                <w:color w:val="000000"/>
+                <w:sz w:val="28"/>
+                <w:szCs w:val="32"/>
+                <w:lang w:val="en-IN"/>
+              </w:rPr>
+            </w:pPr>
+            <w:r>
+              <w:rPr>
+                <w:rFonts w:eastAsia="Times New Roman" w:cs="Arial"/>
+                <w:b/>
+                <w:bCs/>
+                <w:sz w:val="28"/>
+                <w:szCs w:val="28"/>
+                <w:lang w:val="en-IN" w:eastAsia="en-IN" w:bidi="ml-IN"/>
+              </w:rPr>
+              <w:t xml:space="preserve">TS 3.2.2.3- </w:t>
+            </w:r>
+            <w:r>
+              <w:rPr>
+                <w:rFonts w:cs="Arial"/>
+                <w:b/>
+                <w:color w:val="000000"/>
+                <w:sz w:val="28"/>
+                <w:szCs w:val="32"/>
+                <w:lang w:val="en-IN"/>
+              </w:rPr>
+              <w:t>Kramam</w:t>
+            </w:r>
+          </w:p>
+          <w:p>
+            <w:pPr>
+              <w:widowControl w:val="0"/>
+              <w:autoSpaceDE w:val="0"/>
+              <w:autoSpaceDN w:val="0"/>
+              <w:adjustRightInd w:val="0"/>
+              <w:spacing w:before="0" w:line="240" w:lineRule="auto"/>
+              <w:ind w:right="-320"/>
+              <w:jc w:val="both"/>
+              <w:rPr>
+                <w:rFonts w:eastAsia="Times New Roman" w:cs="Arial"/>
+                <w:b/>
+                <w:bCs/>
+                <w:sz w:val="28"/>
+                <w:szCs w:val="28"/>
+                <w:lang w:val="en-IN" w:eastAsia="en-IN" w:bidi="ml-IN"/>
+              </w:rPr>
+            </w:pPr>
+            <w:r>
+              <w:rPr>
+                <w:rFonts w:cs="Arial"/>
+                <w:b/>
+                <w:color w:val="000000"/>
+                <w:sz w:val="28"/>
+                <w:szCs w:val="32"/>
+                <w:lang w:val="en-IN"/>
+              </w:rPr>
+              <w:t>Krama Vaakyam No</w:t>
+            </w:r>
+            <w:r>
+              <w:rPr>
+                <w:rFonts w:eastAsia="Times New Roman" w:cs="Arial"/>
+                <w:b/>
+                <w:bCs/>
+                <w:sz w:val="28"/>
+                <w:szCs w:val="28"/>
+                <w:lang w:val="en-IN" w:eastAsia="en-IN" w:bidi="ml-IN"/>
+              </w:rPr>
+              <w:t>. 21</w:t>
+            </w:r>
+          </w:p>
+          <w:p>
+            <w:pPr>
+              <w:widowControl w:val="0"/>
+              <w:autoSpaceDE w:val="0"/>
+              <w:autoSpaceDN w:val="0"/>
+              <w:adjustRightInd w:val="0"/>
+              <w:spacing w:before="0" w:line="240" w:lineRule="auto"/>
+              <w:ind w:right="-320"/>
+              <w:jc w:val="both"/>
+              <w:rPr>
+                <w:rFonts w:eastAsia="Times New Roman" w:cs="Arial"/>
+                <w:b/>
+                <w:bCs/>
+                <w:sz w:val="28"/>
+                <w:szCs w:val="28"/>
+                <w:lang w:val="it-IT" w:eastAsia="en-IN" w:bidi="ml-IN"/>
+              </w:rPr>
+            </w:pPr>
+            <w:r>
+              <w:rPr>
+                <w:rFonts w:eastAsia="Times New Roman" w:cs="Arial"/>
+                <w:b/>
+                <w:bCs/>
+                <w:sz w:val="28"/>
+                <w:szCs w:val="28"/>
+                <w:lang w:val="it-IT" w:eastAsia="en-IN" w:bidi="ml-IN"/>
+              </w:rPr>
+              <w:t>Panchaati No. 6</w:t>
+            </w:r>
+          </w:p>
+        </w:tc>
+        <w:tc>
+          <w:tcPr>
+            <w:tcW w:w="5103" w:type="dxa"/>
+          </w:tcPr>
+          <w:p>
+            <w:pPr>
+              <w:widowControl w:val="0"/>
+              <w:autoSpaceDE w:val="0"/>
+              <w:autoSpaceDN w:val="0"/>
+              <w:adjustRightInd w:val="0"/>
+              <w:spacing w:before="0" w:line="240" w:lineRule="auto"/>
+              <w:rPr>
+                <w:rFonts w:ascii="BRH Malayalam Extra" w:hAnsi="BRH Malayalam Extra" w:cs="BRH Malayalam Extra"/>
+                <w:color w:val="000000"/>
+                <w:sz w:val="40"/>
+                <w:szCs w:val="40"/>
+                <w:lang w:val="it-IT"/>
+              </w:rPr>
+            </w:pPr>
+            <w:r>
+              <w:rPr>
+                <w:rFonts w:ascii="BRH Malayalam Extra" w:hAnsi="BRH Malayalam Extra" w:cs="BRH Malayalam Extra"/>
+                <w:color w:val="000000"/>
+                <w:sz w:val="40"/>
+                <w:szCs w:val="40"/>
+                <w:lang w:val="it-IT"/>
+              </w:rPr>
+              <w:t>öZõ—IgKx</w:t>
+            </w:r>
+            <w:r>
+              <w:rPr>
+                <w:rFonts w:ascii="BRH Devanagari Extra" w:hAnsi="BRH Devanagari Extra" w:cs="BRH Malayalam Extra"/>
+                <w:color w:val="000000"/>
+                <w:sz w:val="36"/>
+                <w:szCs w:val="40"/>
+                <w:highlight w:val="yellow"/>
+                <w:lang w:val="it-IT"/>
+              </w:rPr>
+              <w:t>óè</w:t>
+            </w:r>
+            <w:r>
+              <w:rPr>
+                <w:rFonts w:ascii="BRH Malayalam Extra" w:hAnsi="BRH Malayalam Extra" w:cs="BRH Malayalam Extra"/>
+                <w:color w:val="000000"/>
+                <w:sz w:val="40"/>
+                <w:szCs w:val="40"/>
+                <w:highlight w:val="yellow"/>
+                <w:lang w:val="it-IT"/>
+              </w:rPr>
+              <w:t xml:space="preserve"> Z£</w:t>
+            </w:r>
+            <w:r>
+              <w:rPr>
+                <w:rFonts w:ascii="BRH Malayalam Extra" w:hAnsi="BRH Malayalam Extra" w:cs="BRH Malayalam Extra"/>
+                <w:color w:val="000000"/>
+                <w:sz w:val="40"/>
+                <w:szCs w:val="40"/>
+                <w:lang w:val="it-IT"/>
+              </w:rPr>
+              <w:t>Zzjsp</w:t>
+            </w:r>
+            <w:r>
+              <w:rPr>
+                <w:rFonts w:ascii="BRH Malayalam Extra" w:hAnsi="BRH Malayalam Extra" w:cs="BRH Malayalam Extra"/>
+                <w:b/>
+                <w:color w:val="000000"/>
+                <w:sz w:val="33"/>
+                <w:szCs w:val="40"/>
+                <w:lang w:val="it-IT"/>
+              </w:rPr>
+              <w:t>–</w:t>
+            </w:r>
+            <w:r>
+              <w:rPr>
+                <w:rFonts w:ascii="BRH Malayalam Extra" w:hAnsi="BRH Malayalam Extra" w:cs="BRH Malayalam Extra"/>
+                <w:color w:val="000000"/>
+                <w:sz w:val="40"/>
+                <w:szCs w:val="40"/>
+                <w:lang w:val="it-IT"/>
+              </w:rPr>
+              <w:t xml:space="preserve">dI | </w:t>
+            </w:r>
+          </w:p>
+          <w:p>
+            <w:pPr>
+              <w:widowControl w:val="0"/>
+              <w:autoSpaceDE w:val="0"/>
+              <w:autoSpaceDN w:val="0"/>
+              <w:adjustRightInd w:val="0"/>
+              <w:spacing w:before="0" w:line="240" w:lineRule="auto"/>
+              <w:rPr>
+                <w:rFonts w:ascii="BRH Malayalam Extra" w:hAnsi="BRH Malayalam Extra" w:cs="BRH Malayalam Extra"/>
+                <w:color w:val="000000"/>
+                <w:sz w:val="40"/>
+                <w:szCs w:val="40"/>
+                <w:lang w:val="it-IT"/>
+              </w:rPr>
+            </w:pPr>
+            <w:r>
+              <w:rPr>
+                <w:rFonts w:ascii="BRH Malayalam Extra" w:hAnsi="BRH Malayalam Extra" w:cs="BRH Malayalam Extra"/>
+                <w:color w:val="000000"/>
+                <w:sz w:val="40"/>
+                <w:szCs w:val="40"/>
+                <w:lang w:val="it-IT"/>
+              </w:rPr>
+              <w:t>öZõ—IgKx</w:t>
+            </w:r>
+            <w:r>
+              <w:rPr>
+                <w:rFonts w:ascii="BRH Malayalam Extra" w:hAnsi="BRH Malayalam Extra" w:cs="BRH Malayalam Extra"/>
+                <w:b/>
+                <w:color w:val="000000"/>
+                <w:sz w:val="33"/>
+                <w:szCs w:val="40"/>
+                <w:lang w:val="it-IT"/>
+              </w:rPr>
+              <w:t>–</w:t>
+            </w:r>
+            <w:r>
+              <w:rPr>
+                <w:rFonts w:ascii="BRH Malayalam Extra" w:hAnsi="BRH Malayalam Extra" w:cs="BRH Malayalam Extra"/>
+                <w:color w:val="000000"/>
+                <w:sz w:val="40"/>
+                <w:szCs w:val="40"/>
+                <w:lang w:val="it-IT"/>
+              </w:rPr>
+              <w:t>dyZy</w:t>
+            </w:r>
+            <w:r>
+              <w:rPr>
+                <w:rFonts w:ascii="BRH Malayalam Extra" w:hAnsi="BRH Malayalam Extra" w:cs="BRH Malayalam Extra"/>
+                <w:b/>
+                <w:color w:val="000000"/>
+                <w:sz w:val="33"/>
+                <w:szCs w:val="40"/>
+                <w:lang w:val="it-IT"/>
+              </w:rPr>
+              <w:t>–</w:t>
+            </w:r>
+            <w:r>
+              <w:rPr>
+                <w:rFonts w:ascii="BRH Malayalam Extra" w:hAnsi="BRH Malayalam Extra" w:cs="BRH Malayalam Extra"/>
+                <w:color w:val="000000"/>
+                <w:sz w:val="40"/>
+                <w:szCs w:val="40"/>
+                <w:lang w:val="it-IT"/>
+              </w:rPr>
+              <w:t xml:space="preserve"> </w:t>
+            </w:r>
+          </w:p>
+          <w:p>
+            <w:pPr>
+              <w:widowControl w:val="0"/>
+              <w:autoSpaceDE w:val="0"/>
+              <w:autoSpaceDN w:val="0"/>
+              <w:adjustRightInd w:val="0"/>
+              <w:spacing w:before="0" w:line="240" w:lineRule="auto"/>
+              <w:rPr>
+                <w:rFonts w:ascii="BRH Malayalam Extra" w:hAnsi="BRH Malayalam Extra" w:cs="BRH Malayalam Extra"/>
+                <w:color w:val="000000"/>
+                <w:sz w:val="40"/>
+                <w:szCs w:val="40"/>
+                <w:lang w:val="it-IT"/>
+              </w:rPr>
+            </w:pPr>
+            <w:r>
+              <w:rPr>
+                <w:rFonts w:ascii="BRH Malayalam Extra" w:hAnsi="BRH Malayalam Extra" w:cs="BRH Malayalam Extra"/>
+                <w:color w:val="000000"/>
+                <w:sz w:val="40"/>
+                <w:szCs w:val="40"/>
+                <w:lang w:val="it-IT"/>
+              </w:rPr>
+              <w:t>öZy - A</w:t>
+            </w:r>
+            <w:r>
+              <w:rPr>
+                <w:rFonts w:ascii="BRH Malayalam Extra" w:hAnsi="BRH Malayalam Extra" w:cs="BRH Malayalam Extra"/>
+                <w:b/>
+                <w:color w:val="000000"/>
+                <w:sz w:val="33"/>
+                <w:szCs w:val="40"/>
+                <w:lang w:val="it-IT"/>
+              </w:rPr>
+              <w:t>–</w:t>
+            </w:r>
+            <w:r>
+              <w:rPr>
+                <w:rFonts w:ascii="BRH Malayalam Extra" w:hAnsi="BRH Malayalam Extra" w:cs="BRH Malayalam Extra"/>
+                <w:color w:val="000000"/>
+                <w:sz w:val="40"/>
+                <w:szCs w:val="40"/>
+                <w:lang w:val="it-IT"/>
+              </w:rPr>
+              <w:t>Ig</w:t>
+            </w:r>
+            <w:r>
+              <w:rPr>
+                <w:rFonts w:ascii="BRH Malayalam Extra" w:hAnsi="BRH Malayalam Extra" w:cs="BRH Malayalam Extra"/>
+                <w:b/>
+                <w:color w:val="000000"/>
+                <w:sz w:val="33"/>
+                <w:szCs w:val="40"/>
+                <w:lang w:val="it-IT"/>
+              </w:rPr>
+              <w:t>–</w:t>
+            </w:r>
+            <w:r>
+              <w:rPr>
+                <w:rFonts w:ascii="BRH Malayalam Extra" w:hAnsi="BRH Malayalam Extra" w:cs="BRH Malayalam Extra"/>
+                <w:color w:val="000000"/>
+                <w:sz w:val="40"/>
+                <w:szCs w:val="40"/>
+                <w:lang w:val="it-IT"/>
+              </w:rPr>
+              <w:t>Kx</w:t>
+            </w:r>
+            <w:r>
+              <w:rPr>
+                <w:rFonts w:ascii="BRH Malayalam Extra" w:hAnsi="BRH Malayalam Extra" w:cs="BRH Malayalam Extra"/>
+                <w:b/>
+                <w:color w:val="000000"/>
+                <w:sz w:val="33"/>
+                <w:szCs w:val="40"/>
+                <w:lang w:val="it-IT"/>
+              </w:rPr>
+              <w:t>–</w:t>
+            </w:r>
+            <w:r>
+              <w:rPr>
+                <w:rFonts w:ascii="BRH Malayalam Extra" w:hAnsi="BRH Malayalam Extra" w:cs="BRH Malayalam Extra"/>
+                <w:color w:val="000000"/>
+                <w:sz w:val="40"/>
+                <w:szCs w:val="40"/>
+                <w:lang w:val="it-IT"/>
+              </w:rPr>
+              <w:t>©</w:t>
+            </w:r>
+            <w:r>
+              <w:rPr>
+                <w:rFonts w:ascii="BRH Malayalam Extra" w:hAnsi="BRH Malayalam Extra" w:cs="BRH Malayalam Extra"/>
+                <w:b/>
+                <w:color w:val="000000"/>
+                <w:sz w:val="33"/>
+                <w:szCs w:val="40"/>
+                <w:lang w:val="it-IT"/>
+              </w:rPr>
+              <w:t>–</w:t>
+            </w:r>
+            <w:r>
+              <w:rPr>
+                <w:rFonts w:ascii="BRH Malayalam Extra" w:hAnsi="BRH Malayalam Extra" w:cs="BRH Malayalam Extra"/>
+                <w:color w:val="000000"/>
+                <w:sz w:val="40"/>
+                <w:szCs w:val="40"/>
+                <w:lang w:val="it-IT"/>
+              </w:rPr>
+              <w:t xml:space="preserve"> | </w:t>
+            </w:r>
+          </w:p>
+        </w:tc>
+        <w:tc>
+          <w:tcPr>
+            <w:tcW w:w="5386" w:type="dxa"/>
+          </w:tcPr>
+          <w:p>
+            <w:pPr>
+              <w:widowControl w:val="0"/>
+              <w:autoSpaceDE w:val="0"/>
+              <w:autoSpaceDN w:val="0"/>
+              <w:adjustRightInd w:val="0"/>
+              <w:spacing w:before="0" w:line="240" w:lineRule="auto"/>
+              <w:rPr>
+                <w:rFonts w:ascii="BRH Malayalam Extra" w:hAnsi="BRH Malayalam Extra" w:cs="BRH Malayalam Extra"/>
+                <w:color w:val="000000"/>
+                <w:sz w:val="40"/>
+                <w:szCs w:val="40"/>
+                <w:lang w:val="it-IT"/>
+              </w:rPr>
+            </w:pPr>
+            <w:r>
+              <w:rPr>
+                <w:rFonts w:ascii="BRH Malayalam Extra" w:hAnsi="BRH Malayalam Extra" w:cs="BRH Malayalam Extra"/>
+                <w:color w:val="000000"/>
+                <w:sz w:val="40"/>
+                <w:szCs w:val="40"/>
+                <w:lang w:val="it-IT"/>
+              </w:rPr>
+              <w:t>öZõ—IgKx</w:t>
+            </w:r>
+            <w:r>
+              <w:rPr>
+                <w:rFonts w:ascii="BRH Devanagari Extra" w:hAnsi="BRH Devanagari Extra" w:cs="BRH Malayalam Extra"/>
+                <w:sz w:val="40"/>
+                <w:szCs w:val="40"/>
+                <w:highlight w:val="green"/>
+                <w:lang w:val="it-IT"/>
+              </w:rPr>
+              <w:t xml:space="preserve">ò </w:t>
+            </w:r>
+            <w:r>
+              <w:rPr>
+                <w:rFonts w:ascii="BRH Malayalam Extra" w:hAnsi="BRH Malayalam Extra" w:cs="BRH Malayalam Extra"/>
+                <w:sz w:val="40"/>
+                <w:szCs w:val="40"/>
+                <w:highlight w:val="green"/>
+                <w:lang w:val="it-IT"/>
+              </w:rPr>
+              <w:t>së£</w:t>
+            </w:r>
+            <w:r>
+              <w:rPr>
+                <w:rFonts w:ascii="BRH Malayalam Extra" w:hAnsi="BRH Malayalam Extra" w:cs="BRH Malayalam Extra"/>
+                <w:color w:val="000000"/>
+                <w:sz w:val="40"/>
+                <w:szCs w:val="40"/>
+                <w:lang w:val="it-IT"/>
+              </w:rPr>
+              <w:t>Zzjsp</w:t>
+            </w:r>
+            <w:r>
+              <w:rPr>
+                <w:rFonts w:ascii="BRH Malayalam Extra" w:hAnsi="BRH Malayalam Extra" w:cs="BRH Malayalam Extra"/>
+                <w:b/>
+                <w:color w:val="000000"/>
+                <w:sz w:val="33"/>
+                <w:szCs w:val="40"/>
+                <w:lang w:val="it-IT"/>
+              </w:rPr>
+              <w:t>–</w:t>
+            </w:r>
+            <w:r>
+              <w:rPr>
+                <w:rFonts w:ascii="BRH Malayalam Extra" w:hAnsi="BRH Malayalam Extra" w:cs="BRH Malayalam Extra"/>
+                <w:color w:val="000000"/>
+                <w:sz w:val="40"/>
+                <w:szCs w:val="40"/>
+                <w:lang w:val="it-IT"/>
+              </w:rPr>
+              <w:t xml:space="preserve">dI | </w:t>
+            </w:r>
+          </w:p>
+          <w:p>
+            <w:pPr>
+              <w:widowControl w:val="0"/>
+              <w:autoSpaceDE w:val="0"/>
+              <w:autoSpaceDN w:val="0"/>
+              <w:adjustRightInd w:val="0"/>
+              <w:spacing w:before="0" w:line="240" w:lineRule="auto"/>
+              <w:rPr>
+                <w:rFonts w:ascii="BRH Malayalam Extra" w:hAnsi="BRH Malayalam Extra" w:cs="BRH Malayalam Extra"/>
+                <w:color w:val="000000"/>
+                <w:sz w:val="40"/>
+                <w:szCs w:val="40"/>
+                <w:lang w:val="it-IT"/>
+              </w:rPr>
+            </w:pPr>
+            <w:r>
+              <w:rPr>
+                <w:rFonts w:ascii="BRH Malayalam Extra" w:hAnsi="BRH Malayalam Extra" w:cs="BRH Malayalam Extra"/>
+                <w:color w:val="000000"/>
+                <w:sz w:val="40"/>
+                <w:szCs w:val="40"/>
+                <w:lang w:val="it-IT"/>
+              </w:rPr>
+              <w:t>öZõ—IgKx</w:t>
+            </w:r>
+            <w:r>
+              <w:rPr>
+                <w:rFonts w:ascii="BRH Malayalam Extra" w:hAnsi="BRH Malayalam Extra" w:cs="BRH Malayalam Extra"/>
+                <w:b/>
+                <w:color w:val="000000"/>
+                <w:sz w:val="33"/>
+                <w:szCs w:val="40"/>
+                <w:lang w:val="it-IT"/>
+              </w:rPr>
+              <w:t>–</w:t>
+            </w:r>
+            <w:r>
+              <w:rPr>
+                <w:rFonts w:ascii="BRH Malayalam Extra" w:hAnsi="BRH Malayalam Extra" w:cs="BRH Malayalam Extra"/>
+                <w:color w:val="000000"/>
+                <w:sz w:val="40"/>
+                <w:szCs w:val="40"/>
+                <w:lang w:val="it-IT"/>
+              </w:rPr>
+              <w:t>dyZy</w:t>
+            </w:r>
+            <w:r>
+              <w:rPr>
+                <w:rFonts w:ascii="BRH Malayalam Extra" w:hAnsi="BRH Malayalam Extra" w:cs="BRH Malayalam Extra"/>
+                <w:b/>
+                <w:color w:val="000000"/>
+                <w:sz w:val="33"/>
+                <w:szCs w:val="40"/>
+                <w:lang w:val="it-IT"/>
+              </w:rPr>
+              <w:t>–</w:t>
+            </w:r>
+            <w:r>
+              <w:rPr>
+                <w:rFonts w:ascii="BRH Malayalam Extra" w:hAnsi="BRH Malayalam Extra" w:cs="BRH Malayalam Extra"/>
+                <w:color w:val="000000"/>
+                <w:sz w:val="40"/>
+                <w:szCs w:val="40"/>
+                <w:lang w:val="it-IT"/>
+              </w:rPr>
+              <w:t xml:space="preserve"> </w:t>
+            </w:r>
+          </w:p>
+          <w:p>
+            <w:pPr>
+              <w:widowControl w:val="0"/>
+              <w:autoSpaceDE w:val="0"/>
+              <w:autoSpaceDN w:val="0"/>
+              <w:adjustRightInd w:val="0"/>
+              <w:spacing w:before="0" w:line="240" w:lineRule="auto"/>
+              <w:rPr>
+                <w:rFonts w:ascii="BRH Malayalam Extra" w:hAnsi="BRH Malayalam Extra" w:cs="BRH Malayalam Extra"/>
+                <w:color w:val="000000"/>
+                <w:sz w:val="40"/>
+                <w:szCs w:val="40"/>
+                <w:lang w:val="it-IT"/>
+              </w:rPr>
+            </w:pPr>
+            <w:r>
+              <w:rPr>
+                <w:rFonts w:ascii="BRH Malayalam Extra" w:hAnsi="BRH Malayalam Extra" w:cs="BRH Malayalam Extra"/>
+                <w:color w:val="000000"/>
+                <w:sz w:val="40"/>
+                <w:szCs w:val="40"/>
+                <w:lang w:val="it-IT"/>
+              </w:rPr>
+              <w:t>öZy - A</w:t>
+            </w:r>
+            <w:r>
+              <w:rPr>
+                <w:rFonts w:ascii="BRH Malayalam Extra" w:hAnsi="BRH Malayalam Extra" w:cs="BRH Malayalam Extra"/>
+                <w:b/>
+                <w:color w:val="000000"/>
+                <w:sz w:val="33"/>
+                <w:szCs w:val="40"/>
+                <w:lang w:val="it-IT"/>
+              </w:rPr>
+              <w:t>–</w:t>
+            </w:r>
+            <w:r>
+              <w:rPr>
+                <w:rFonts w:ascii="BRH Malayalam Extra" w:hAnsi="BRH Malayalam Extra" w:cs="BRH Malayalam Extra"/>
+                <w:color w:val="000000"/>
+                <w:sz w:val="40"/>
+                <w:szCs w:val="40"/>
+                <w:lang w:val="it-IT"/>
+              </w:rPr>
+              <w:t>Ig</w:t>
+            </w:r>
+            <w:r>
+              <w:rPr>
+                <w:rFonts w:ascii="BRH Malayalam Extra" w:hAnsi="BRH Malayalam Extra" w:cs="BRH Malayalam Extra"/>
+                <w:b/>
+                <w:color w:val="000000"/>
+                <w:sz w:val="33"/>
+                <w:szCs w:val="40"/>
+                <w:lang w:val="it-IT"/>
+              </w:rPr>
+              <w:t>–</w:t>
+            </w:r>
+            <w:r>
+              <w:rPr>
+                <w:rFonts w:ascii="BRH Malayalam Extra" w:hAnsi="BRH Malayalam Extra" w:cs="BRH Malayalam Extra"/>
+                <w:color w:val="000000"/>
+                <w:sz w:val="40"/>
+                <w:szCs w:val="40"/>
+                <w:lang w:val="it-IT"/>
+              </w:rPr>
+              <w:t>Kx</w:t>
+            </w:r>
+            <w:r>
+              <w:rPr>
+                <w:rFonts w:ascii="BRH Malayalam Extra" w:hAnsi="BRH Malayalam Extra" w:cs="BRH Malayalam Extra"/>
+                <w:b/>
+                <w:color w:val="000000"/>
+                <w:sz w:val="33"/>
+                <w:szCs w:val="40"/>
+                <w:lang w:val="it-IT"/>
+              </w:rPr>
+              <w:t>–</w:t>
+            </w:r>
+            <w:r>
+              <w:rPr>
+                <w:rFonts w:ascii="BRH Malayalam Extra" w:hAnsi="BRH Malayalam Extra" w:cs="BRH Malayalam Extra"/>
+                <w:color w:val="000000"/>
+                <w:sz w:val="40"/>
+                <w:szCs w:val="40"/>
+                <w:lang w:val="it-IT"/>
+              </w:rPr>
+              <w:t>©</w:t>
+            </w:r>
+            <w:r>
+              <w:rPr>
+                <w:rFonts w:ascii="BRH Malayalam Extra" w:hAnsi="BRH Malayalam Extra" w:cs="BRH Malayalam Extra"/>
+                <w:b/>
+                <w:color w:val="000000"/>
+                <w:sz w:val="33"/>
+                <w:szCs w:val="40"/>
+                <w:lang w:val="it-IT"/>
+              </w:rPr>
+              <w:t>–</w:t>
+            </w:r>
+            <w:r>
+              <w:rPr>
+                <w:rFonts w:ascii="BRH Malayalam Extra" w:hAnsi="BRH Malayalam Extra" w:cs="BRH Malayalam Extra"/>
+                <w:color w:val="000000"/>
+                <w:sz w:val="40"/>
+                <w:szCs w:val="40"/>
+                <w:lang w:val="it-IT"/>
+              </w:rPr>
+              <w:t xml:space="preserve"> | </w:t>
             </w:r>
           </w:p>
         </w:tc>
@@ -216,6 +1393,7 @@
         <w:tc>
           <w:tcPr>
             <w:tcW w:w="3906" w:type="dxa"/>
+            <w:gridSpan w:val="2"/>
           </w:tcPr>
           <w:p>
             <w:pPr>
@@ -254,27 +1432,7 @@
                 <w:sz w:val="28"/>
                 <w:szCs w:val="32"/>
               </w:rPr>
-              <w:t>3.2.</w:t>
-            </w:r>
-            <w:r>
-              <w:rPr>
-                <w:rFonts w:cs="Arial"/>
-                <w:b/>
-                <w:color w:val="000000"/>
-                <w:sz w:val="28"/>
-                <w:szCs w:val="32"/>
-              </w:rPr>
-              <w:t>8.3</w:t>
-            </w:r>
-            <w:r>
-              <w:rPr>
-                <w:rFonts w:cs="Arial"/>
-                <w:b/>
-                <w:color w:val="000000"/>
-                <w:sz w:val="28"/>
-                <w:szCs w:val="32"/>
-              </w:rPr>
-              <w:t xml:space="preserve"> </w:t>
+              <w:t xml:space="preserve">3.2.8.3 </w:t>
             </w:r>
             <w:r>
               <w:rPr>
@@ -304,30 +1462,19 @@
                 <w:color w:val="000000"/>
                 <w:sz w:val="28"/>
                 <w:szCs w:val="32"/>
-                <w:lang w:val="it-IT"/>
-              </w:rPr>
-            </w:pPr>
-            <w:r>
-              <w:rPr>
-                <w:rFonts w:cs="Arial"/>
-                <w:b/>
-                <w:color w:val="000000"/>
-                <w:sz w:val="28"/>
-                <w:szCs w:val="32"/>
-                <w:lang w:val="it-IT"/>
-              </w:rPr>
-              <w:t xml:space="preserve">Krama Vaakyam No. - </w:t>
-            </w:r>
-            <w:r>
-              <w:rPr>
-                <w:rFonts w:cs="Arial"/>
-                <w:b/>
-                <w:color w:val="000000"/>
-                <w:sz w:val="28"/>
-                <w:szCs w:val="32"/>
-                <w:lang w:val="it-IT"/>
-              </w:rPr>
-              <w:t>35</w:t>
+                <w:lang w:val="en-IN"/>
+              </w:rPr>
+            </w:pPr>
+            <w:r>
+              <w:rPr>
+                <w:rFonts w:cs="Arial"/>
+                <w:b/>
+                <w:color w:val="000000"/>
+                <w:sz w:val="28"/>
+                <w:szCs w:val="32"/>
+                <w:lang w:val="en-IN"/>
+              </w:rPr>
+              <w:t>Krama Vaakyam No. - 35</w:t>
             </w:r>
           </w:p>
           <w:p>
@@ -369,17 +1516,7 @@
                 <w:szCs w:val="32"/>
                 <w:lang w:val="it-IT"/>
               </w:rPr>
-              <w:t xml:space="preserve">. - </w:t>
-            </w:r>
-            <w:r>
-              <w:rPr>
-                <w:rFonts w:cs="Arial"/>
-                <w:b/>
-                <w:color w:val="000000"/>
-                <w:szCs w:val="32"/>
-                <w:lang w:val="it-IT"/>
-              </w:rPr>
-              <w:t>3</w:t>
+              <w:t>. - 3</w:t>
             </w:r>
             <w:r>
               <w:rPr>
@@ -410,14 +1547,16 @@
                 <w:color w:val="000000"/>
                 <w:sz w:val="40"/>
                 <w:szCs w:val="40"/>
-              </w:rPr>
-            </w:pPr>
-            <w:r>
-              <w:rPr>
-                <w:rFonts w:ascii="BRH Malayalam Extra" w:hAnsi="BRH Malayalam Extra" w:cs="BRH Malayalam Extra"/>
-                <w:color w:val="000000"/>
-                <w:sz w:val="40"/>
-                <w:szCs w:val="40"/>
+                <w:lang w:val="it-IT"/>
+              </w:rPr>
+            </w:pPr>
+            <w:r>
+              <w:rPr>
+                <w:rFonts w:ascii="BRH Malayalam Extra" w:hAnsi="BRH Malayalam Extra" w:cs="BRH Malayalam Extra"/>
+                <w:color w:val="000000"/>
+                <w:sz w:val="40"/>
+                <w:szCs w:val="40"/>
+                <w:lang w:val="it-IT"/>
               </w:rPr>
               <w:t>j</w:t>
             </w:r>
@@ -428,15 +1567,17 @@
                 <w:color w:val="000000"/>
                 <w:sz w:val="33"/>
                 <w:szCs w:val="40"/>
-              </w:rPr>
-              <w:t>–</w:t>
-            </w:r>
-            <w:r>
-              <w:rPr>
-                <w:rFonts w:ascii="BRH Malayalam Extra" w:hAnsi="BRH Malayalam Extra" w:cs="BRH Malayalam Extra"/>
-                <w:color w:val="000000"/>
-                <w:sz w:val="40"/>
-                <w:szCs w:val="40"/>
+                <w:lang w:val="it-IT"/>
+              </w:rPr>
+              <w:t>–</w:t>
+            </w:r>
+            <w:r>
+              <w:rPr>
+                <w:rFonts w:ascii="BRH Malayalam Extra" w:hAnsi="BRH Malayalam Extra" w:cs="BRH Malayalam Extra"/>
+                <w:color w:val="000000"/>
+                <w:sz w:val="40"/>
+                <w:szCs w:val="40"/>
+                <w:lang w:val="it-IT"/>
               </w:rPr>
               <w:t>¹Kx—ixJ s¡¥b</w:t>
             </w:r>
@@ -447,15 +1588,17 @@
                 <w:color w:val="000000"/>
                 <w:sz w:val="33"/>
                 <w:szCs w:val="40"/>
-              </w:rPr>
-              <w:t>–</w:t>
-            </w:r>
-            <w:r>
-              <w:rPr>
-                <w:rFonts w:ascii="BRH Malayalam Extra" w:hAnsi="BRH Malayalam Extra" w:cs="BRH Malayalam Extra"/>
-                <w:color w:val="000000"/>
-                <w:sz w:val="40"/>
-                <w:szCs w:val="40"/>
+                <w:lang w:val="it-IT"/>
+              </w:rPr>
+              <w:t>–</w:t>
+            </w:r>
+            <w:r>
+              <w:rPr>
+                <w:rFonts w:ascii="BRH Malayalam Extra" w:hAnsi="BRH Malayalam Extra" w:cs="BRH Malayalam Extra"/>
+                <w:color w:val="000000"/>
+                <w:sz w:val="40"/>
+                <w:szCs w:val="40"/>
+                <w:lang w:val="it-IT"/>
               </w:rPr>
               <w:t xml:space="preserve">pxJ | </w:t>
             </w:r>
@@ -879,7 +2022,6 @@
           <w:sz w:val="32"/>
           <w:szCs w:val="32"/>
           <w:u w:val="single"/>
-          <w:lang w:val="it-IT"/>
         </w:rPr>
       </w:pPr>
     </w:p>
@@ -892,7 +2034,6 @@
           <w:sz w:val="32"/>
           <w:szCs w:val="32"/>
           <w:u w:val="single"/>
-          <w:lang w:val="it-IT"/>
         </w:rPr>
       </w:pPr>
     </w:p>
@@ -982,6 +2123,7 @@
           <w:b/>
           <w:bCs/>
         </w:rPr>
+        <w:lastRenderedPageBreak/>
         <w:t>(ignore those which are already incorporated in your book’s version and date)</w:t>
       </w:r>
     </w:p>
@@ -1717,7 +2859,6 @@
                 <w:sz w:val="32"/>
                 <w:szCs w:val="32"/>
               </w:rPr>
-              <w:lastRenderedPageBreak/>
               <w:t>Reference</w:t>
             </w:r>
           </w:p>
@@ -1740,7 +2881,6 @@
                 <w:sz w:val="32"/>
                 <w:szCs w:val="32"/>
               </w:rPr>
-              <w:lastRenderedPageBreak/>
               <w:t>As Printed</w:t>
             </w:r>
           </w:p>
@@ -3246,6 +4386,7 @@
                 <w:sz w:val="28"/>
                 <w:szCs w:val="32"/>
               </w:rPr>
+              <w:lastRenderedPageBreak/>
               <w:t>T.S.</w:t>
             </w:r>
             <w:r>
@@ -4312,7 +5453,6 @@
                 <w:sz w:val="28"/>
                 <w:szCs w:val="32"/>
               </w:rPr>
-              <w:lastRenderedPageBreak/>
               <w:t>T.S.</w:t>
             </w:r>
             <w:r>
@@ -5275,16 +6415,7 @@
           <w:bCs/>
           <w:sz w:val="32"/>
         </w:rPr>
-        <w:t xml:space="preserve">replaced </w:t>
-      </w:r>
-      <w:proofErr w:type="gramStart"/>
-      <w:r>
-        <w:rPr>
-          <w:b/>
-          <w:bCs/>
-          <w:sz w:val="32"/>
-        </w:rPr>
-        <w:t>with</w:t>
+        <w:t>replaced with</w:t>
       </w:r>
       <w:r>
         <w:rPr>
@@ -5306,7 +6437,6 @@
         </w:rPr>
         <w:t>"</w:t>
       </w:r>
-      <w:proofErr w:type="gramEnd"/>
       <w:r>
         <w:rPr>
           <w:rFonts w:ascii="BRH Malayalam" w:hAnsi="BRH Malayalam" w:cs="BRH Malayalam"/>
@@ -5318,7 +6448,6 @@
         </w:rPr>
         <w:t>q§T</w:t>
       </w:r>
-      <w:proofErr w:type="gramStart"/>
       <w:r>
         <w:rPr>
           <w:rFonts w:ascii="BRH Malayalam" w:hAnsi="BRH Malayalam" w:cs="BRH Malayalam"/>
@@ -5335,16 +6464,7 @@
           <w:bCs/>
           <w:sz w:val="32"/>
         </w:rPr>
-        <w:t>wherever</w:t>
-      </w:r>
-      <w:proofErr w:type="gramEnd"/>
-      <w:r>
-        <w:rPr>
-          <w:b/>
-          <w:bCs/>
-          <w:sz w:val="32"/>
-        </w:rPr>
-        <w:t xml:space="preserve"> applicable</w:t>
+        <w:t>wherever applicable</w:t>
       </w:r>
     </w:p>
     <w:p>
@@ -5401,6 +6521,7 @@
           <w:szCs w:val="32"/>
           <w:u w:val="single"/>
         </w:rPr>
+        <w:lastRenderedPageBreak/>
         <w:t xml:space="preserve">TS Krama Paatam – TS </w:t>
       </w:r>
       <w:r>

</xml_diff>